<commit_message>
v1.12.7: Portable export: add offline-catalogue section (destinations + confidentiality/ACL) to export user guide + technical manual
</commit_message>
<xml_diff>
--- a/docs/export-data-user-guide.docx
+++ b/docs/export-data-user-guide.docx
@@ -7,7 +7,7 @@
         <w:pStyle w:val="Title"/>
       </w:pPr>
       <w:r>
-        <w:t xml:space="preserve">Exporting Your Data</w:t>
+        <w:t xml:space="preserve">Exporting Your Data — User Guide</w:t>
       </w:r>
     </w:p>
     <w:p>
@@ -18,7 +18,7 @@
         <w:t xml:space="preserve">The Archive and Heritage Group (Pty) Ltd</w:t>
       </w:r>
     </w:p>
-    <w:bookmarkStart w:id="47" w:name="exporting-your-data"/>
+    <w:bookmarkStart w:id="52" w:name="exporting-your-data"/>
     <w:p>
       <w:pPr>
         <w:pStyle w:val="Heading1"/>
@@ -111,14 +111,14 @@
     <w:tbl>
       <w:tblPr>
         <w:tblStyle w:val="Table"/>
-        <w:tblW w:type="auto" w:w="0"/>
+        <w:tblW w:type="pct" w:w="5000"/>
         <w:tblLook w:firstRow="1" w:lastRow="0" w:firstColumn="0" w:lastColumn="0" w:noHBand="0" w:noVBand="0" w:val="0020"/>
         <w:jc w:val="start"/>
       </w:tblPr>
       <w:tblGrid>
-        <w:gridCol w:w="2640"/>
-        <w:gridCol w:w="2640"/>
-        <w:gridCol w:w="2640"/>
+        <w:gridCol w:w="2043"/>
+        <w:gridCol w:w="2554"/>
+        <w:gridCol w:w="3321"/>
       </w:tblGrid>
       <w:tr>
         <w:trPr>
@@ -371,7 +371,79 @@
           </w:p>
         </w:tc>
       </w:tr>
+      <w:tr>
+        <w:tc>
+          <w:tcPr/>
+          <w:p>
+            <w:pPr>
+              <w:pStyle w:val="Compact"/>
+              <w:jc w:val="left"/>
+            </w:pPr>
+            <w:r>
+              <w:rPr>
+                <w:bCs/>
+                <w:b/>
+              </w:rPr>
+              <w:t xml:space="preserve">Portable Catalogue</w:t>
+            </w:r>
+          </w:p>
+        </w:tc>
+        <w:tc>
+          <w:tcPr/>
+          <w:p>
+            <w:pPr>
+              <w:pStyle w:val="Compact"/>
+              <w:jc w:val="left"/>
+            </w:pPr>
+            <w:r>
+              <w:t xml:space="preserve">Offline browsing on CD/USB, or moving a whole collection between systems</w:t>
+            </w:r>
+          </w:p>
+        </w:tc>
+        <w:tc>
+          <w:tcPr/>
+          <w:p>
+            <w:pPr>
+              <w:pStyle w:val="Compact"/>
+              <w:jc w:val="left"/>
+            </w:pPr>
+            <w:r>
+              <w:t xml:space="preserve">Outreach, exhibitions, data portability</w:t>
+            </w:r>
+          </w:p>
+        </w:tc>
+      </w:tr>
     </w:tbl>
+    <w:p>
+      <w:pPr>
+        <w:pStyle w:val="BodyText"/>
+      </w:pPr>
+      <w:r>
+        <w:t xml:space="preserve">For the</w:t>
+      </w:r>
+      <w:r>
+        <w:t xml:space="preserve"> </w:t>
+      </w:r>
+      <w:r>
+        <w:rPr>
+          <w:bCs/>
+          <w:b/>
+        </w:rPr>
+        <w:t xml:space="preserve">Portable Catalogue</w:t>
+      </w:r>
+      <w:r>
+        <w:t xml:space="preserve"> </w:t>
+      </w:r>
+      <w:r>
+        <w:t xml:space="preserve">option — a self-contained, offline browsable copy of</w:t>
+      </w:r>
+      <w:r>
+        <w:t xml:space="preserve"> </w:t>
+      </w:r>
+      <w:r>
+        <w:t xml:space="preserve">your collection — see the dedicated section below.</w:t>
+      </w:r>
+    </w:p>
     <w:p>
       <w:r>
         <w:pict>
@@ -2209,22 +2281,185 @@
     </w:p>
     <w:bookmarkEnd w:id="36"/>
     <w:bookmarkEnd w:id="37"/>
-    <w:bookmarkStart w:id="41" w:name="understanding-export-files"/>
+    <w:bookmarkStart w:id="42" w:name="portable-offline-catalogue-export"/>
     <w:p>
       <w:pPr>
         <w:pStyle w:val="Heading2"/>
       </w:pPr>
       <w:r>
-        <w:t xml:space="preserve">Understanding Export Files</w:t>
-      </w:r>
-    </w:p>
-    <w:bookmarkStart w:id="38" w:name="csv-files"/>
+        <w:t xml:space="preserve">Portable / Offline Catalogue Export</w:t>
+      </w:r>
+    </w:p>
+    <w:p>
+      <w:pPr>
+        <w:pStyle w:val="FirstParagraph"/>
+      </w:pPr>
+      <w:r>
+        <w:t xml:space="preserve">Sometimes you need your catalogue to travel — to an exhibition kiosk with no internet,</w:t>
+      </w:r>
+      <w:r>
+        <w:t xml:space="preserve"> </w:t>
+      </w:r>
+      <w:r>
+        <w:t xml:space="preserve">onto a USB stick for a researcher, burned to CD for a depositor, or moved wholesale into</w:t>
+      </w:r>
+      <w:r>
+        <w:t xml:space="preserve"> </w:t>
+      </w:r>
+      <w:r>
+        <w:t xml:space="preserve">another system. The</w:t>
+      </w:r>
+      <w:r>
+        <w:t xml:space="preserve"> </w:t>
+      </w:r>
+      <w:r>
+        <w:rPr>
+          <w:bCs/>
+          <w:b/>
+        </w:rPr>
+        <w:t xml:space="preserve">Portable Export</w:t>
+      </w:r>
+      <w:r>
+        <w:t xml:space="preserve"> </w:t>
+      </w:r>
+      <w:r>
+        <w:t xml:space="preserve">tool builds a self-contained copy for exactly</w:t>
+      </w:r>
+      <w:r>
+        <w:t xml:space="preserve"> </w:t>
+      </w:r>
+      <w:r>
+        <w:t xml:space="preserve">this. Open it from</w:t>
+      </w:r>
+      <w:r>
+        <w:t xml:space="preserve"> </w:t>
+      </w:r>
+      <w:r>
+        <w:rPr>
+          <w:bCs/>
+          <w:b/>
+        </w:rPr>
+        <w:t xml:space="preserve">Admin &gt; Portable Export</w:t>
+      </w:r>
+      <w:r>
+        <w:t xml:space="preserve">.</w:t>
+      </w:r>
+    </w:p>
+    <w:bookmarkStart w:id="38" w:name="two-kinds-of-package"/>
     <w:p>
       <w:pPr>
         <w:pStyle w:val="Heading3"/>
       </w:pPr>
       <w:r>
-        <w:t xml:space="preserve">CSV Files</w:t>
+        <w:t xml:space="preserve">Two kinds of package</w:t>
+      </w:r>
+    </w:p>
+    <w:p>
+      <w:pPr>
+        <w:numPr>
+          <w:ilvl w:val="0"/>
+          <w:numId w:val="1005"/>
+        </w:numPr>
+        <w:pStyle w:val="Compact"/>
+      </w:pPr>
+      <w:r>
+        <w:rPr>
+          <w:bCs/>
+          <w:b/>
+        </w:rPr>
+        <w:t xml:space="preserve">Viewer (offline catalogue)</w:t>
+      </w:r>
+      <w:r>
+        <w:t xml:space="preserve"> </w:t>
+      </w:r>
+      <w:r>
+        <w:t xml:space="preserve">— a complete little website. Double-click</w:t>
+      </w:r>
+      <w:r>
+        <w:t xml:space="preserve"> </w:t>
+      </w:r>
+      <w:r>
+        <w:rPr>
+          <w:rStyle w:val="VerbatimChar"/>
+        </w:rPr>
+        <w:t xml:space="preserve">index.html</w:t>
+      </w:r>
+      <w:r>
+        <w:t xml:space="preserve"> </w:t>
+      </w:r>
+      <w:r>
+        <w:t xml:space="preserve">and browse, search and view images in any web browser, with</w:t>
+      </w:r>
+      <w:r>
+        <w:t xml:space="preserve"> </w:t>
+      </w:r>
+      <w:r>
+        <w:rPr>
+          <w:bCs/>
+          <w:b/>
+        </w:rPr>
+        <w:t xml:space="preserve">no server and no</w:t>
+      </w:r>
+      <w:r>
+        <w:rPr>
+          <w:bCs/>
+          <w:b/>
+        </w:rPr>
+        <w:t xml:space="preserve"> </w:t>
+      </w:r>
+      <w:r>
+        <w:rPr>
+          <w:bCs/>
+          <w:b/>
+        </w:rPr>
+        <w:t xml:space="preserve">internet</w:t>
+      </w:r>
+      <w:r>
+        <w:t xml:space="preserve">. Ideal for CDs, USB sticks, and public-access terminals.</w:t>
+      </w:r>
+    </w:p>
+    <w:p>
+      <w:pPr>
+        <w:numPr>
+          <w:ilvl w:val="0"/>
+          <w:numId w:val="1005"/>
+        </w:numPr>
+        <w:pStyle w:val="Compact"/>
+      </w:pPr>
+      <w:r>
+        <w:rPr>
+          <w:bCs/>
+          <w:b/>
+        </w:rPr>
+        <w:t xml:space="preserve">Archive (data package)</w:t>
+      </w:r>
+      <w:r>
+        <w:t xml:space="preserve"> </w:t>
+      </w:r>
+      <w:r>
+        <w:t xml:space="preserve">— structured data files for every record type, with</w:t>
+      </w:r>
+      <w:r>
+        <w:t xml:space="preserve"> </w:t>
+      </w:r>
+      <w:r>
+        <w:t xml:space="preserve">checksums, for moving or preserving the whole collection. Used to re-import into</w:t>
+      </w:r>
+      <w:r>
+        <w:t xml:space="preserve"> </w:t>
+      </w:r>
+      <w:r>
+        <w:t xml:space="preserve">another Heratio/AtoM instance.</w:t>
+      </w:r>
+    </w:p>
+    <w:bookmarkEnd w:id="38"/>
+    <w:bookmarkStart w:id="39" w:name="choosing-where-it-goes"/>
+    <w:p>
+      <w:pPr>
+        <w:pStyle w:val="Heading3"/>
+      </w:pPr>
+      <w:r>
+        <w:t xml:space="preserve">Choosing where it goes</w:t>
       </w:r>
     </w:p>
     <w:p>
@@ -2232,118 +2467,359 @@
         <w:pStyle w:val="FirstParagraph"/>
       </w:pPr>
       <w:r>
-        <w:t xml:space="preserve">Opens in Excel or Google Sheets. Each row is one record.</w:t>
-      </w:r>
-    </w:p>
-    <w:p>
-      <w:pPr>
-        <w:pStyle w:val="SourceCode"/>
-      </w:pPr>
-      <w:r>
-        <w:rPr>
-          <w:rStyle w:val="VerbatimChar"/>
-        </w:rPr>
-        <w:t xml:space="preserve">┌────────────────────────────────────────────────────────────┐</w:t>
-      </w:r>
-      <w:r>
-        <w:br/>
-      </w:r>
-      <w:r>
-        <w:rPr>
-          <w:rStyle w:val="VerbatimChar"/>
-        </w:rPr>
-        <w:t xml:space="preserve">│  A           │  B        │  C                │  D          │</w:t>
-      </w:r>
-      <w:r>
-        <w:br/>
-      </w:r>
-      <w:r>
-        <w:rPr>
-          <w:rStyle w:val="VerbatimChar"/>
-        </w:rPr>
-        <w:t xml:space="preserve">├──────────────┼───────────┼───────────────────┼─────────────┤</w:t>
-      </w:r>
-      <w:r>
-        <w:br/>
-      </w:r>
-      <w:r>
-        <w:rPr>
-          <w:rStyle w:val="VerbatimChar"/>
-        </w:rPr>
-        <w:t xml:space="preserve">│  Identifier  │  Title    │  Date             │  Creator    │</w:t>
-      </w:r>
-      <w:r>
-        <w:br/>
-      </w:r>
-      <w:r>
-        <w:rPr>
-          <w:rStyle w:val="VerbatimChar"/>
-        </w:rPr>
-        <w:t xml:space="preserve">├──────────────┼───────────┼───────────────────┼─────────────┤</w:t>
-      </w:r>
-      <w:r>
-        <w:br/>
-      </w:r>
-      <w:r>
-        <w:rPr>
-          <w:rStyle w:val="VerbatimChar"/>
-        </w:rPr>
-        <w:t xml:space="preserve">│  F001        │  Smith    │  1920-1950        │  John Smith │</w:t>
-      </w:r>
-      <w:r>
-        <w:br/>
-      </w:r>
-      <w:r>
-        <w:rPr>
-          <w:rStyle w:val="VerbatimChar"/>
-        </w:rPr>
-        <w:t xml:space="preserve">│              │  Papers   │                   │             │</w:t>
-      </w:r>
-      <w:r>
-        <w:br/>
-      </w:r>
-      <w:r>
-        <w:rPr>
-          <w:rStyle w:val="VerbatimChar"/>
-        </w:rPr>
-        <w:t xml:space="preserve">├──────────────┼───────────┼───────────────────┼─────────────┤</w:t>
-      </w:r>
-      <w:r>
-        <w:br/>
-      </w:r>
-      <w:r>
-        <w:rPr>
-          <w:rStyle w:val="VerbatimChar"/>
-        </w:rPr>
-        <w:t xml:space="preserve">│  F001/S1     │  Corres-  │  1920-1935        │             │</w:t>
-      </w:r>
-      <w:r>
-        <w:br/>
-      </w:r>
-      <w:r>
-        <w:rPr>
-          <w:rStyle w:val="VerbatimChar"/>
-        </w:rPr>
-        <w:t xml:space="preserve">│              │  pondence │                   │             │</w:t>
-      </w:r>
-      <w:r>
-        <w:br/>
-      </w:r>
-      <w:r>
-        <w:rPr>
-          <w:rStyle w:val="VerbatimChar"/>
-        </w:rPr>
-        <w:t xml:space="preserve">└──────────────┴───────────┴───────────────────┴─────────────┘</w:t>
-      </w:r>
-    </w:p>
-    <w:bookmarkEnd w:id="38"/>
-    <w:bookmarkStart w:id="39" w:name="ead-files"/>
+        <w:t xml:space="preserve">When you build a package you choose a</w:t>
+      </w:r>
+      <w:r>
+        <w:t xml:space="preserve"> </w:t>
+      </w:r>
+      <w:r>
+        <w:rPr>
+          <w:bCs/>
+          <w:b/>
+        </w:rPr>
+        <w:t xml:space="preserve">destination</w:t>
+      </w:r>
+      <w:r>
+        <w:t xml:space="preserve">:</w:t>
+      </w:r>
+    </w:p>
+    <w:tbl>
+      <w:tblPr>
+        <w:tblStyle w:val="Table"/>
+        <w:tblW w:type="pct" w:w="5000"/>
+        <w:tblLook w:firstRow="1" w:lastRow="0" w:firstColumn="0" w:lastColumn="0" w:noHBand="0" w:noVBand="0" w:val="0020"/>
+        <w:jc w:val="start"/>
+      </w:tblPr>
+      <w:tblGrid>
+        <w:gridCol w:w="2640"/>
+        <w:gridCol w:w="2843"/>
+        <w:gridCol w:w="2436"/>
+      </w:tblGrid>
+      <w:tr>
+        <w:trPr>
+          <w:tblHeader w:val="true"/>
+        </w:trPr>
+        <w:tc>
+          <w:tcPr/>
+          <w:p>
+            <w:pPr>
+              <w:pStyle w:val="Compact"/>
+              <w:jc w:val="left"/>
+            </w:pPr>
+            <w:r>
+              <w:t xml:space="preserve">Destination</w:t>
+            </w:r>
+          </w:p>
+        </w:tc>
+        <w:tc>
+          <w:tcPr/>
+          <w:p>
+            <w:pPr>
+              <w:pStyle w:val="Compact"/>
+              <w:jc w:val="left"/>
+            </w:pPr>
+            <w:r>
+              <w:t xml:space="preserve">What it does</w:t>
+            </w:r>
+          </w:p>
+        </w:tc>
+        <w:tc>
+          <w:tcPr/>
+          <w:p>
+            <w:pPr>
+              <w:pStyle w:val="Compact"/>
+              <w:jc w:val="left"/>
+            </w:pPr>
+            <w:r>
+              <w:t xml:space="preserve">Use it for</w:t>
+            </w:r>
+          </w:p>
+        </w:tc>
+      </w:tr>
+      <w:tr>
+        <w:tc>
+          <w:tcPr/>
+          <w:p>
+            <w:pPr>
+              <w:pStyle w:val="Compact"/>
+              <w:jc w:val="left"/>
+            </w:pPr>
+            <w:r>
+              <w:rPr>
+                <w:bCs/>
+                <w:b/>
+              </w:rPr>
+              <w:t xml:space="preserve">ZIP file</w:t>
+            </w:r>
+          </w:p>
+        </w:tc>
+        <w:tc>
+          <w:tcPr/>
+          <w:p>
+            <w:pPr>
+              <w:pStyle w:val="Compact"/>
+              <w:jc w:val="left"/>
+            </w:pPr>
+            <w:r>
+              <w:t xml:space="preserve">Makes a single</w:t>
+            </w:r>
+            <w:r>
+              <w:t xml:space="preserve"> </w:t>
+            </w:r>
+            <w:r>
+              <w:rPr>
+                <w:rStyle w:val="VerbatimChar"/>
+              </w:rPr>
+              <w:t xml:space="preserve">.zip</w:t>
+            </w:r>
+            <w:r>
+              <w:t xml:space="preserve"> </w:t>
+            </w:r>
+            <w:r>
+              <w:t xml:space="preserve">you download when it’s ready</w:t>
+            </w:r>
+          </w:p>
+        </w:tc>
+        <w:tc>
+          <w:tcPr/>
+          <w:p>
+            <w:pPr>
+              <w:pStyle w:val="Compact"/>
+              <w:jc w:val="left"/>
+            </w:pPr>
+            <w:r>
+              <w:t xml:space="preserve">The everyday choice — email, share, archive</w:t>
+            </w:r>
+          </w:p>
+        </w:tc>
+      </w:tr>
+      <w:tr>
+        <w:tc>
+          <w:tcPr/>
+          <w:p>
+            <w:pPr>
+              <w:pStyle w:val="Compact"/>
+              <w:jc w:val="left"/>
+            </w:pPr>
+            <w:r>
+              <w:rPr>
+                <w:bCs/>
+                <w:b/>
+              </w:rPr>
+              <w:t xml:space="preserve">This computer</w:t>
+            </w:r>
+          </w:p>
+        </w:tc>
+        <w:tc>
+          <w:tcPr/>
+          <w:p>
+            <w:pPr>
+              <w:pStyle w:val="Compact"/>
+              <w:jc w:val="left"/>
+            </w:pPr>
+            <w:r>
+              <w:t xml:space="preserve">After building, asks you to pick a folder or drive</w:t>
+            </w:r>
+            <w:r>
+              <w:t xml:space="preserve"> </w:t>
+            </w:r>
+            <w:r>
+              <w:rPr>
+                <w:bCs/>
+                <w:b/>
+              </w:rPr>
+              <w:t xml:space="preserve">on your own PC, laptop or USB</w:t>
+            </w:r>
+            <w:r>
+              <w:t xml:space="preserve">, and writes the catalogue there</w:t>
+            </w:r>
+            <w:r>
+              <w:t xml:space="preserve"> </w:t>
+            </w:r>
+            <w:r>
+              <w:rPr>
+                <w:bCs/>
+                <w:b/>
+              </w:rPr>
+              <w:t xml:space="preserve">unzipped</w:t>
+            </w:r>
+            <w:r>
+              <w:t xml:space="preserve"> </w:t>
+            </w:r>
+            <w:r>
+              <w:t xml:space="preserve">so it runs straight off the drive</w:t>
+            </w:r>
+          </w:p>
+        </w:tc>
+        <w:tc>
+          <w:tcPr/>
+          <w:p>
+            <w:pPr>
+              <w:pStyle w:val="Compact"/>
+              <w:jc w:val="left"/>
+            </w:pPr>
+            <w:r>
+              <w:t xml:space="preserve">Copying to USB/external drives with no unzip step</w:t>
+            </w:r>
+          </w:p>
+        </w:tc>
+      </w:tr>
+      <w:tr>
+        <w:tc>
+          <w:tcPr/>
+          <w:p>
+            <w:pPr>
+              <w:pStyle w:val="Compact"/>
+              <w:jc w:val="left"/>
+            </w:pPr>
+            <w:r>
+              <w:rPr>
+                <w:bCs/>
+                <w:b/>
+              </w:rPr>
+              <w:t xml:space="preserve">Server folder / drive</w:t>
+            </w:r>
+          </w:p>
+        </w:tc>
+        <w:tc>
+          <w:tcPr/>
+          <w:p>
+            <w:pPr>
+              <w:pStyle w:val="Compact"/>
+              <w:jc w:val="left"/>
+            </w:pPr>
+            <w:r>
+              <w:t xml:space="preserve">Writes it uncompressed straight to a drive</w:t>
+            </w:r>
+            <w:r>
+              <w:t xml:space="preserve"> </w:t>
+            </w:r>
+            <w:r>
+              <w:rPr>
+                <w:bCs/>
+                <w:b/>
+              </w:rPr>
+              <w:t xml:space="preserve">on the server</w:t>
+            </w:r>
+          </w:p>
+        </w:tc>
+        <w:tc>
+          <w:tcPr/>
+          <w:p>
+            <w:pPr>
+              <w:pStyle w:val="Compact"/>
+              <w:jc w:val="left"/>
+            </w:pPr>
+            <w:r>
+              <w:t xml:space="preserve">Very large collections too big for a ZIP</w:t>
+            </w:r>
+          </w:p>
+        </w:tc>
+      </w:tr>
+    </w:tbl>
+    <w:p>
+      <w:pPr>
+        <w:pStyle w:val="BlockText"/>
+      </w:pPr>
+      <w:r>
+        <w:rPr>
+          <w:bCs/>
+          <w:b/>
+        </w:rPr>
+        <w:t xml:space="preserve">“</w:t>
+      </w:r>
+      <w:r>
+        <w:rPr>
+          <w:bCs/>
+          <w:b/>
+        </w:rPr>
+        <w:t xml:space="preserve">This computer</w:t>
+      </w:r>
+      <w:r>
+        <w:rPr>
+          <w:bCs/>
+          <w:b/>
+        </w:rPr>
+        <w:t xml:space="preserve">”</w:t>
+      </w:r>
+      <w:r>
+        <w:rPr>
+          <w:bCs/>
+          <w:b/>
+        </w:rPr>
+        <w:t xml:space="preserve"> </w:t>
+      </w:r>
+      <w:r>
+        <w:rPr>
+          <w:bCs/>
+          <w:b/>
+        </w:rPr>
+        <w:t xml:space="preserve">tip:</w:t>
+      </w:r>
+      <w:r>
+        <w:t xml:space="preserve"> </w:t>
+      </w:r>
+      <w:r>
+        <w:t xml:space="preserve">this uses a modern browser feature available in</w:t>
+      </w:r>
+      <w:r>
+        <w:t xml:space="preserve"> </w:t>
+      </w:r>
+      <w:r>
+        <w:rPr>
+          <w:bCs/>
+          <w:b/>
+        </w:rPr>
+        <w:t xml:space="preserve">Chrome,</w:t>
+      </w:r>
+      <w:r>
+        <w:rPr>
+          <w:bCs/>
+          <w:b/>
+        </w:rPr>
+        <w:t xml:space="preserve"> </w:t>
+      </w:r>
+      <w:r>
+        <w:rPr>
+          <w:bCs/>
+          <w:b/>
+        </w:rPr>
+        <w:t xml:space="preserve">Edge and Opera</w:t>
+      </w:r>
+      <w:r>
+        <w:t xml:space="preserve">. In other browsers (Firefox, Safari) it simply gives you a ZIP</w:t>
+      </w:r>
+      <w:r>
+        <w:t xml:space="preserve"> </w:t>
+      </w:r>
+      <w:r>
+        <w:t xml:space="preserve">download instead. When the export finishes, click</w:t>
+      </w:r>
+      <w:r>
+        <w:t xml:space="preserve"> </w:t>
+      </w:r>
+      <w:r>
+        <w:rPr>
+          <w:bCs/>
+          <w:b/>
+        </w:rPr>
+        <w:t xml:space="preserve">Save to folder on this computer</w:t>
+      </w:r>
+      <w:r>
+        <w:t xml:space="preserve"> </w:t>
+      </w:r>
+      <w:r>
+        <w:t xml:space="preserve">and choose where to put it.</w:t>
+      </w:r>
+    </w:p>
+    <w:bookmarkEnd w:id="39"/>
+    <w:bookmarkStart w:id="40" w:name="what-is-included-and-what-is-held-back"/>
     <w:p>
       <w:pPr>
         <w:pStyle w:val="Heading3"/>
       </w:pPr>
       <w:r>
-        <w:t xml:space="preserve">EAD Files</w:t>
+        <w:t xml:space="preserve">What is included — and what is held back</w:t>
       </w:r>
     </w:p>
     <w:p>
@@ -2351,395 +2827,413 @@
         <w:pStyle w:val="FirstParagraph"/>
       </w:pPr>
       <w:r>
-        <w:t xml:space="preserve">XML format for archival finding aids. Opens in text editors or specialised software.</w:t>
-      </w:r>
-    </w:p>
-    <w:p>
-      <w:pPr>
-        <w:pStyle w:val="SourceCode"/>
-      </w:pPr>
-      <w:r>
-        <w:rPr>
-          <w:rStyle w:val="NormalTok"/>
-        </w:rPr>
-        <w:t xml:space="preserve">&lt;</w:t>
-      </w:r>
-      <w:r>
-        <w:rPr>
-          <w:rStyle w:val="KeywordTok"/>
-        </w:rPr>
-        <w:t xml:space="preserve">ead</w:t>
-      </w:r>
-      <w:r>
-        <w:rPr>
-          <w:rStyle w:val="NormalTok"/>
-        </w:rPr>
-        <w:t xml:space="preserve">&gt;</w:t>
-      </w:r>
-      <w:r>
-        <w:br/>
-      </w:r>
-      <w:r>
-        <w:rPr>
-          <w:rStyle w:val="NormalTok"/>
-        </w:rPr>
-        <w:t xml:space="preserve">  &lt;</w:t>
-      </w:r>
-      <w:r>
-        <w:rPr>
-          <w:rStyle w:val="KeywordTok"/>
-        </w:rPr>
-        <w:t xml:space="preserve">archdesc</w:t>
-      </w:r>
-      <w:r>
-        <w:rPr>
-          <w:rStyle w:val="NormalTok"/>
-        </w:rPr>
-        <w:t xml:space="preserve">&gt;</w:t>
-      </w:r>
-      <w:r>
-        <w:br/>
-      </w:r>
-      <w:r>
-        <w:rPr>
-          <w:rStyle w:val="NormalTok"/>
-        </w:rPr>
-        <w:t xml:space="preserve">    &lt;</w:t>
-      </w:r>
-      <w:r>
-        <w:rPr>
-          <w:rStyle w:val="KeywordTok"/>
-        </w:rPr>
-        <w:t xml:space="preserve">did</w:t>
-      </w:r>
-      <w:r>
-        <w:rPr>
-          <w:rStyle w:val="NormalTok"/>
-        </w:rPr>
-        <w:t xml:space="preserve">&gt;</w:t>
-      </w:r>
-      <w:r>
-        <w:br/>
-      </w:r>
-      <w:r>
-        <w:rPr>
-          <w:rStyle w:val="NormalTok"/>
-        </w:rPr>
-        <w:t xml:space="preserve">      &lt;</w:t>
-      </w:r>
-      <w:r>
-        <w:rPr>
-          <w:rStyle w:val="KeywordTok"/>
-        </w:rPr>
-        <w:t xml:space="preserve">unitid</w:t>
-      </w:r>
-      <w:r>
-        <w:rPr>
-          <w:rStyle w:val="NormalTok"/>
-        </w:rPr>
-        <w:t xml:space="preserve">&gt;F001&lt;/</w:t>
-      </w:r>
-      <w:r>
-        <w:rPr>
-          <w:rStyle w:val="KeywordTok"/>
-        </w:rPr>
-        <w:t xml:space="preserve">unitid</w:t>
-      </w:r>
-      <w:r>
-        <w:rPr>
-          <w:rStyle w:val="NormalTok"/>
-        </w:rPr>
-        <w:t xml:space="preserve">&gt;</w:t>
-      </w:r>
-      <w:r>
-        <w:br/>
-      </w:r>
-      <w:r>
-        <w:rPr>
-          <w:rStyle w:val="NormalTok"/>
-        </w:rPr>
-        <w:t xml:space="preserve">      &lt;</w:t>
-      </w:r>
-      <w:r>
-        <w:rPr>
-          <w:rStyle w:val="KeywordTok"/>
-        </w:rPr>
-        <w:t xml:space="preserve">unittitle</w:t>
-      </w:r>
-      <w:r>
-        <w:rPr>
-          <w:rStyle w:val="NormalTok"/>
-        </w:rPr>
-        <w:t xml:space="preserve">&gt;Smith Papers&lt;/</w:t>
-      </w:r>
-      <w:r>
-        <w:rPr>
-          <w:rStyle w:val="KeywordTok"/>
-        </w:rPr>
-        <w:t xml:space="preserve">unittitle</w:t>
-      </w:r>
-      <w:r>
-        <w:rPr>
-          <w:rStyle w:val="NormalTok"/>
-        </w:rPr>
-        <w:t xml:space="preserve">&gt;</w:t>
-      </w:r>
-      <w:r>
-        <w:br/>
-      </w:r>
-      <w:r>
-        <w:rPr>
-          <w:rStyle w:val="NormalTok"/>
-        </w:rPr>
-        <w:t xml:space="preserve">      &lt;</w:t>
-      </w:r>
-      <w:r>
-        <w:rPr>
-          <w:rStyle w:val="KeywordTok"/>
-        </w:rPr>
-        <w:t xml:space="preserve">unitdate</w:t>
-      </w:r>
-      <w:r>
-        <w:rPr>
-          <w:rStyle w:val="NormalTok"/>
-        </w:rPr>
-        <w:t xml:space="preserve">&gt;1920-1950&lt;/</w:t>
-      </w:r>
-      <w:r>
-        <w:rPr>
-          <w:rStyle w:val="KeywordTok"/>
-        </w:rPr>
-        <w:t xml:space="preserve">unitdate</w:t>
-      </w:r>
-      <w:r>
-        <w:rPr>
-          <w:rStyle w:val="NormalTok"/>
-        </w:rPr>
-        <w:t xml:space="preserve">&gt;</w:t>
-      </w:r>
-      <w:r>
-        <w:br/>
-      </w:r>
-      <w:r>
-        <w:rPr>
-          <w:rStyle w:val="NormalTok"/>
-        </w:rPr>
-        <w:t xml:space="preserve">    &lt;/</w:t>
-      </w:r>
-      <w:r>
-        <w:rPr>
-          <w:rStyle w:val="KeywordTok"/>
-        </w:rPr>
-        <w:t xml:space="preserve">did</w:t>
-      </w:r>
-      <w:r>
-        <w:rPr>
-          <w:rStyle w:val="NormalTok"/>
-        </w:rPr>
-        <w:t xml:space="preserve">&gt;</w:t>
-      </w:r>
-      <w:r>
-        <w:br/>
-      </w:r>
-      <w:r>
-        <w:rPr>
-          <w:rStyle w:val="NormalTok"/>
-        </w:rPr>
-        <w:t xml:space="preserve">  &lt;/</w:t>
-      </w:r>
-      <w:r>
-        <w:rPr>
-          <w:rStyle w:val="KeywordTok"/>
-        </w:rPr>
-        <w:t xml:space="preserve">archdesc</w:t>
-      </w:r>
-      <w:r>
-        <w:rPr>
-          <w:rStyle w:val="NormalTok"/>
-        </w:rPr>
-        <w:t xml:space="preserve">&gt;</w:t>
-      </w:r>
-      <w:r>
-        <w:br/>
-      </w:r>
-      <w:r>
-        <w:rPr>
-          <w:rStyle w:val="NormalTok"/>
-        </w:rPr>
-        <w:t xml:space="preserve">&lt;/</w:t>
-      </w:r>
-      <w:r>
-        <w:rPr>
-          <w:rStyle w:val="KeywordTok"/>
-        </w:rPr>
-        <w:t xml:space="preserve">ead</w:t>
-      </w:r>
-      <w:r>
-        <w:rPr>
-          <w:rStyle w:val="NormalTok"/>
-        </w:rPr>
-        <w:t xml:space="preserve">&gt;</w:t>
-      </w:r>
-    </w:p>
-    <w:bookmarkEnd w:id="39"/>
-    <w:bookmarkStart w:id="40" w:name="dublin-core-files"/>
+        <w:t xml:space="preserve">A portable package can leave the building and can’t be recalled, so the system is</w:t>
+      </w:r>
+      <w:r>
+        <w:t xml:space="preserve"> </w:t>
+      </w:r>
+      <w:r>
+        <w:t xml:space="preserve">careful about what goes into it.</w:t>
+      </w:r>
+      <w:r>
+        <w:t xml:space="preserve"> </w:t>
+      </w:r>
+      <w:r>
+        <w:rPr>
+          <w:bCs/>
+          <w:b/>
+        </w:rPr>
+        <w:t xml:space="preserve">You only ever export what you are allowed to see</w:t>
+      </w:r>
+      <w:r>
+        <w:t xml:space="preserve">,</w:t>
+      </w:r>
+      <w:r>
+        <w:t xml:space="preserve"> </w:t>
+      </w:r>
+      <w:r>
+        <w:t xml:space="preserve">and some records are always held back:</w:t>
+      </w:r>
+    </w:p>
+    <w:p>
+      <w:pPr>
+        <w:numPr>
+          <w:ilvl w:val="0"/>
+          <w:numId w:val="1006"/>
+        </w:numPr>
+        <w:pStyle w:val="Compact"/>
+      </w:pPr>
+      <w:r>
+        <w:rPr>
+          <w:bCs/>
+          <w:b/>
+        </w:rPr>
+        <w:t xml:space="preserve">Records above your access</w:t>
+      </w:r>
+      <w:r>
+        <w:t xml:space="preserve"> </w:t>
+      </w:r>
+      <w:r>
+        <w:t xml:space="preserve">— anything beyond your security clearance, closed by a</w:t>
+      </w:r>
+      <w:r>
+        <w:t xml:space="preserve"> </w:t>
+      </w:r>
+      <w:r>
+        <w:t xml:space="preserve">donor agreement, or under embargo is left out (just as it is hidden from you in</w:t>
+      </w:r>
+      <w:r>
+        <w:t xml:space="preserve"> </w:t>
+      </w:r>
+      <w:r>
+        <w:t xml:space="preserve">search). Administrators see everything.</w:t>
+      </w:r>
+    </w:p>
+    <w:p>
+      <w:pPr>
+        <w:numPr>
+          <w:ilvl w:val="0"/>
+          <w:numId w:val="1006"/>
+        </w:numPr>
+        <w:pStyle w:val="Compact"/>
+      </w:pPr>
+      <w:r>
+        <w:rPr>
+          <w:bCs/>
+          <w:b/>
+        </w:rPr>
+        <w:t xml:space="preserve">Unpublished drafts</w:t>
+      </w:r>
+      <w:r>
+        <w:t xml:space="preserve"> </w:t>
+      </w:r>
+      <w:r>
+        <w:t xml:space="preserve">— held back unless an administrator has turned on</w:t>
+      </w:r>
+      <w:r>
+        <w:t xml:space="preserve"> </w:t>
+      </w:r>
+      <w:r>
+        <w:t xml:space="preserve">“</w:t>
+      </w:r>
+      <w:r>
+        <w:t xml:space="preserve">include</w:t>
+      </w:r>
+      <w:r>
+        <w:t xml:space="preserve"> </w:t>
+      </w:r>
+      <w:r>
+        <w:t xml:space="preserve">unpublished</w:t>
+      </w:r>
+      <w:r>
+        <w:t xml:space="preserve">”</w:t>
+      </w:r>
+      <w:r>
+        <w:t xml:space="preserve">.</w:t>
+      </w:r>
+    </w:p>
+    <w:p>
+      <w:pPr>
+        <w:numPr>
+          <w:ilvl w:val="0"/>
+          <w:numId w:val="1006"/>
+        </w:numPr>
+        <w:pStyle w:val="Compact"/>
+      </w:pPr>
+      <w:r>
+        <w:rPr>
+          <w:bCs/>
+          <w:b/>
+        </w:rPr>
+        <w:t xml:space="preserve">Culturally-restricted (ICIP/TK) records</w:t>
+      </w:r>
+      <w:r>
+        <w:t xml:space="preserve"> </w:t>
+      </w:r>
+      <w:r>
+        <w:t xml:space="preserve">— never exported without authority.</w:t>
+      </w:r>
+    </w:p>
+    <w:p>
+      <w:pPr>
+        <w:numPr>
+          <w:ilvl w:val="0"/>
+          <w:numId w:val="1006"/>
+        </w:numPr>
+        <w:pStyle w:val="Compact"/>
+      </w:pPr>
+      <w:r>
+        <w:rPr>
+          <w:bCs/>
+          <w:b/>
+        </w:rPr>
+        <w:t xml:space="preserve">Records with access-policy prohibitions</w:t>
+      </w:r>
+      <w:r>
+        <w:t xml:space="preserve">, and any images redacted for privacy.</w:t>
+      </w:r>
+    </w:p>
+    <w:p>
+      <w:pPr>
+        <w:pStyle w:val="FirstParagraph"/>
+      </w:pPr>
+      <w:r>
+        <w:t xml:space="preserve">Every package includes a small</w:t>
+      </w:r>
+      <w:r>
+        <w:t xml:space="preserve"> </w:t>
+      </w:r>
+      <w:r>
+        <w:rPr>
+          <w:rStyle w:val="VerbatimChar"/>
+          <w:bCs/>
+          <w:b/>
+        </w:rPr>
+        <w:t xml:space="preserve">disclosure-summary.json</w:t>
+      </w:r>
+      <w:r>
+        <w:t xml:space="preserve"> </w:t>
+      </w:r>
+      <w:r>
+        <w:t xml:space="preserve">listing how many records</w:t>
+      </w:r>
+      <w:r>
+        <w:t xml:space="preserve"> </w:t>
+      </w:r>
+      <w:r>
+        <w:t xml:space="preserve">were held back and why, and the export list shows a</w:t>
+      </w:r>
+      <w:r>
+        <w:t xml:space="preserve"> </w:t>
+      </w:r>
+      <w:r>
+        <w:rPr>
+          <w:bCs/>
+          <w:b/>
+        </w:rPr>
+        <w:t xml:space="preserve">“</w:t>
+      </w:r>
+      <w:r>
+        <w:rPr>
+          <w:bCs/>
+          <w:b/>
+        </w:rPr>
+        <w:t xml:space="preserve">N withheld</w:t>
+      </w:r>
+      <w:r>
+        <w:rPr>
+          <w:bCs/>
+          <w:b/>
+        </w:rPr>
+        <w:t xml:space="preserve">”</w:t>
+      </w:r>
+      <w:r>
+        <w:t xml:space="preserve"> </w:t>
+      </w:r>
+      <w:r>
+        <w:t xml:space="preserve">shield badge with</w:t>
+      </w:r>
+      <w:r>
+        <w:t xml:space="preserve"> </w:t>
+      </w:r>
+      <w:r>
+        <w:t xml:space="preserve">a breakdown. Seeing a withheld count is normal — it means the rules are being honoured.</w:t>
+      </w:r>
+    </w:p>
+    <w:bookmarkEnd w:id="40"/>
+    <w:bookmarkStart w:id="41" w:name="steps-2"/>
     <w:p>
       <w:pPr>
         <w:pStyle w:val="Heading3"/>
       </w:pPr>
       <w:r>
-        <w:t xml:space="preserve">Dublin Core Files</w:t>
-      </w:r>
-    </w:p>
-    <w:p>
-      <w:pPr>
-        <w:pStyle w:val="FirstParagraph"/>
-      </w:pPr>
-      <w:r>
-        <w:t xml:space="preserve">Simple XML format for sharing metadata.</w:t>
-      </w:r>
-    </w:p>
-    <w:p>
-      <w:pPr>
-        <w:pStyle w:val="SourceCode"/>
-      </w:pPr>
-      <w:r>
-        <w:rPr>
-          <w:rStyle w:val="NormalTok"/>
-        </w:rPr>
-        <w:t xml:space="preserve">&lt;</w:t>
-      </w:r>
-      <w:r>
-        <w:rPr>
-          <w:rStyle w:val="KeywordTok"/>
-        </w:rPr>
-        <w:t xml:space="preserve">record</w:t>
-      </w:r>
-      <w:r>
-        <w:rPr>
-          <w:rStyle w:val="NormalTok"/>
-        </w:rPr>
-        <w:t xml:space="preserve">&gt;</w:t>
-      </w:r>
-      <w:r>
-        <w:br/>
-      </w:r>
-      <w:r>
-        <w:rPr>
-          <w:rStyle w:val="NormalTok"/>
-        </w:rPr>
-        <w:t xml:space="preserve">  &lt;</w:t>
-      </w:r>
-      <w:r>
-        <w:rPr>
-          <w:rStyle w:val="KeywordTok"/>
-        </w:rPr>
-        <w:t xml:space="preserve">dc:identifier</w:t>
-      </w:r>
-      <w:r>
-        <w:rPr>
-          <w:rStyle w:val="NormalTok"/>
-        </w:rPr>
-        <w:t xml:space="preserve">&gt;F001&lt;/</w:t>
-      </w:r>
-      <w:r>
-        <w:rPr>
-          <w:rStyle w:val="KeywordTok"/>
-        </w:rPr>
-        <w:t xml:space="preserve">dc:identifier</w:t>
-      </w:r>
-      <w:r>
-        <w:rPr>
-          <w:rStyle w:val="NormalTok"/>
-        </w:rPr>
-        <w:t xml:space="preserve">&gt;</w:t>
-      </w:r>
-      <w:r>
-        <w:br/>
-      </w:r>
-      <w:r>
-        <w:rPr>
-          <w:rStyle w:val="NormalTok"/>
-        </w:rPr>
-        <w:t xml:space="preserve">  &lt;</w:t>
-      </w:r>
-      <w:r>
-        <w:rPr>
-          <w:rStyle w:val="KeywordTok"/>
-        </w:rPr>
-        <w:t xml:space="preserve">dc:title</w:t>
-      </w:r>
-      <w:r>
-        <w:rPr>
-          <w:rStyle w:val="NormalTok"/>
-        </w:rPr>
-        <w:t xml:space="preserve">&gt;Smith Papers&lt;/</w:t>
-      </w:r>
-      <w:r>
-        <w:rPr>
-          <w:rStyle w:val="KeywordTok"/>
-        </w:rPr>
-        <w:t xml:space="preserve">dc:title</w:t>
-      </w:r>
-      <w:r>
-        <w:rPr>
-          <w:rStyle w:val="NormalTok"/>
-        </w:rPr>
-        <w:t xml:space="preserve">&gt;</w:t>
-      </w:r>
-      <w:r>
-        <w:br/>
-      </w:r>
-      <w:r>
-        <w:rPr>
-          <w:rStyle w:val="NormalTok"/>
-        </w:rPr>
-        <w:t xml:space="preserve">  &lt;</w:t>
-      </w:r>
-      <w:r>
-        <w:rPr>
-          <w:rStyle w:val="KeywordTok"/>
-        </w:rPr>
-        <w:t xml:space="preserve">dc:date</w:t>
-      </w:r>
-      <w:r>
-        <w:rPr>
-          <w:rStyle w:val="NormalTok"/>
-        </w:rPr>
-        <w:t xml:space="preserve">&gt;1920-1950&lt;/</w:t>
-      </w:r>
-      <w:r>
-        <w:rPr>
-          <w:rStyle w:val="KeywordTok"/>
-        </w:rPr>
-        <w:t xml:space="preserve">dc:date</w:t>
-      </w:r>
-      <w:r>
-        <w:rPr>
-          <w:rStyle w:val="NormalTok"/>
-        </w:rPr>
-        <w:t xml:space="preserve">&gt;</w:t>
-      </w:r>
-      <w:r>
-        <w:br/>
-      </w:r>
-      <w:r>
-        <w:rPr>
-          <w:rStyle w:val="NormalTok"/>
-        </w:rPr>
-        <w:t xml:space="preserve">&lt;/</w:t>
-      </w:r>
-      <w:r>
-        <w:rPr>
-          <w:rStyle w:val="KeywordTok"/>
-        </w:rPr>
-        <w:t xml:space="preserve">record</w:t>
-      </w:r>
-      <w:r>
-        <w:rPr>
-          <w:rStyle w:val="NormalTok"/>
-        </w:rPr>
-        <w:t xml:space="preserve">&gt;</w:t>
+        <w:t xml:space="preserve">Steps</w:t>
+      </w:r>
+    </w:p>
+    <w:p>
+      <w:pPr>
+        <w:numPr>
+          <w:ilvl w:val="0"/>
+          <w:numId w:val="1007"/>
+        </w:numPr>
+        <w:pStyle w:val="Compact"/>
+      </w:pPr>
+      <w:r>
+        <w:t xml:space="preserve">Go to</w:t>
+      </w:r>
+      <w:r>
+        <w:t xml:space="preserve"> </w:t>
+      </w:r>
+      <w:r>
+        <w:rPr>
+          <w:bCs/>
+          <w:b/>
+        </w:rPr>
+        <w:t xml:space="preserve">Admin &gt; Portable Export</w:t>
+      </w:r>
+      <w:r>
+        <w:t xml:space="preserve">.</w:t>
+      </w:r>
+    </w:p>
+    <w:p>
+      <w:pPr>
+        <w:numPr>
+          <w:ilvl w:val="0"/>
+          <w:numId w:val="1007"/>
+        </w:numPr>
+        <w:pStyle w:val="Compact"/>
+      </w:pPr>
+      <w:r>
+        <w:rPr>
+          <w:bCs/>
+          <w:b/>
+        </w:rPr>
+        <w:t xml:space="preserve">Scope</w:t>
+      </w:r>
+      <w:r>
+        <w:t xml:space="preserve"> </w:t>
+      </w:r>
+      <w:r>
+        <w:t xml:space="preserve">— choose the whole catalogue, one fonds/collection, or a repository.</w:t>
+      </w:r>
+    </w:p>
+    <w:p>
+      <w:pPr>
+        <w:numPr>
+          <w:ilvl w:val="0"/>
+          <w:numId w:val="1007"/>
+        </w:numPr>
+        <w:pStyle w:val="Compact"/>
+      </w:pPr>
+      <w:r>
+        <w:rPr>
+          <w:bCs/>
+          <w:b/>
+        </w:rPr>
+        <w:t xml:space="preserve">Content</w:t>
+      </w:r>
+      <w:r>
+        <w:t xml:space="preserve"> </w:t>
+      </w:r>
+      <w:r>
+        <w:t xml:space="preserve">— pick Viewer or Archive, and whether to include digital objects.</w:t>
+      </w:r>
+    </w:p>
+    <w:p>
+      <w:pPr>
+        <w:numPr>
+          <w:ilvl w:val="0"/>
+          <w:numId w:val="1007"/>
+        </w:numPr>
+        <w:pStyle w:val="Compact"/>
+      </w:pPr>
+      <w:r>
+        <w:rPr>
+          <w:bCs/>
+          <w:b/>
+        </w:rPr>
+        <w:t xml:space="preserve">Configure</w:t>
+      </w:r>
+      <w:r>
+        <w:t xml:space="preserve"> </w:t>
+      </w:r>
+      <w:r>
+        <w:t xml:space="preserve">— give it a title, language and (for viewers) branding.</w:t>
+      </w:r>
+    </w:p>
+    <w:p>
+      <w:pPr>
+        <w:numPr>
+          <w:ilvl w:val="0"/>
+          <w:numId w:val="1007"/>
+        </w:numPr>
+        <w:pStyle w:val="Compact"/>
+      </w:pPr>
+      <w:r>
+        <w:rPr>
+          <w:bCs/>
+          <w:b/>
+        </w:rPr>
+        <w:t xml:space="preserve">Destination</w:t>
+      </w:r>
+      <w:r>
+        <w:t xml:space="preserve"> </w:t>
+      </w:r>
+      <w:r>
+        <w:t xml:space="preserve">— ZIP, This computer, or Server folder/drive.</w:t>
+      </w:r>
+    </w:p>
+    <w:p>
+      <w:pPr>
+        <w:numPr>
+          <w:ilvl w:val="0"/>
+          <w:numId w:val="1007"/>
+        </w:numPr>
+        <w:pStyle w:val="Compact"/>
+      </w:pPr>
+      <w:r>
+        <w:rPr>
+          <w:bCs/>
+          <w:b/>
+        </w:rPr>
+        <w:t xml:space="preserve">Generate</w:t>
+      </w:r>
+      <w:r>
+        <w:t xml:space="preserve"> </w:t>
+      </w:r>
+      <w:r>
+        <w:t xml:space="preserve">— click</w:t>
+      </w:r>
+      <w:r>
+        <w:t xml:space="preserve"> </w:t>
+      </w:r>
+      <w:r>
+        <w:rPr>
+          <w:bCs/>
+          <w:b/>
+        </w:rPr>
+        <w:t xml:space="preserve">Start Export</w:t>
+      </w:r>
+      <w:r>
+        <w:t xml:space="preserve"> </w:t>
+      </w:r>
+      <w:r>
+        <w:t xml:space="preserve">and watch the progress bar. When it’s done,</w:t>
+      </w:r>
+      <w:r>
+        <w:t xml:space="preserve"> </w:t>
+      </w:r>
+      <w:r>
+        <w:t xml:space="preserve">use</w:t>
+      </w:r>
+      <w:r>
+        <w:t xml:space="preserve"> </w:t>
+      </w:r>
+      <w:r>
+        <w:rPr>
+          <w:bCs/>
+          <w:b/>
+        </w:rPr>
+        <w:t xml:space="preserve">Save to folder on this computer</w:t>
+      </w:r>
+      <w:r>
+        <w:t xml:space="preserve"> </w:t>
+      </w:r>
+      <w:r>
+        <w:t xml:space="preserve">or</w:t>
+      </w:r>
+      <w:r>
+        <w:t xml:space="preserve"> </w:t>
+      </w:r>
+      <w:r>
+        <w:rPr>
+          <w:bCs/>
+          <w:b/>
+        </w:rPr>
+        <w:t xml:space="preserve">Download ZIP</w:t>
+      </w:r>
+      <w:r>
+        <w:t xml:space="preserve">.</w:t>
       </w:r>
     </w:p>
     <w:p>
@@ -2749,18 +3243,560 @@
         </w:pict>
       </w:r>
     </w:p>
-    <w:bookmarkEnd w:id="40"/>
     <w:bookmarkEnd w:id="41"/>
-    <w:bookmarkStart w:id="44" w:name="export-settings"/>
+    <w:bookmarkEnd w:id="42"/>
+    <w:bookmarkStart w:id="46" w:name="understanding-export-files"/>
     <w:p>
       <w:pPr>
         <w:pStyle w:val="Heading2"/>
       </w:pPr>
       <w:r>
+        <w:t xml:space="preserve">Understanding Export Files</w:t>
+      </w:r>
+    </w:p>
+    <w:bookmarkStart w:id="43" w:name="csv-files"/>
+    <w:p>
+      <w:pPr>
+        <w:pStyle w:val="Heading3"/>
+      </w:pPr>
+      <w:r>
+        <w:t xml:space="preserve">CSV Files</w:t>
+      </w:r>
+    </w:p>
+    <w:p>
+      <w:pPr>
+        <w:pStyle w:val="FirstParagraph"/>
+      </w:pPr>
+      <w:r>
+        <w:t xml:space="preserve">Opens in Excel or Google Sheets. Each row is one record.</w:t>
+      </w:r>
+    </w:p>
+    <w:p>
+      <w:pPr>
+        <w:pStyle w:val="SourceCode"/>
+      </w:pPr>
+      <w:r>
+        <w:rPr>
+          <w:rStyle w:val="VerbatimChar"/>
+        </w:rPr>
+        <w:t xml:space="preserve">┌────────────────────────────────────────────────────────────┐</w:t>
+      </w:r>
+      <w:r>
+        <w:br/>
+      </w:r>
+      <w:r>
+        <w:rPr>
+          <w:rStyle w:val="VerbatimChar"/>
+        </w:rPr>
+        <w:t xml:space="preserve">│  A           │  B        │  C                │  D          │</w:t>
+      </w:r>
+      <w:r>
+        <w:br/>
+      </w:r>
+      <w:r>
+        <w:rPr>
+          <w:rStyle w:val="VerbatimChar"/>
+        </w:rPr>
+        <w:t xml:space="preserve">├──────────────┼───────────┼───────────────────┼─────────────┤</w:t>
+      </w:r>
+      <w:r>
+        <w:br/>
+      </w:r>
+      <w:r>
+        <w:rPr>
+          <w:rStyle w:val="VerbatimChar"/>
+        </w:rPr>
+        <w:t xml:space="preserve">│  Identifier  │  Title    │  Date             │  Creator    │</w:t>
+      </w:r>
+      <w:r>
+        <w:br/>
+      </w:r>
+      <w:r>
+        <w:rPr>
+          <w:rStyle w:val="VerbatimChar"/>
+        </w:rPr>
+        <w:t xml:space="preserve">├──────────────┼───────────┼───────────────────┼─────────────┤</w:t>
+      </w:r>
+      <w:r>
+        <w:br/>
+      </w:r>
+      <w:r>
+        <w:rPr>
+          <w:rStyle w:val="VerbatimChar"/>
+        </w:rPr>
+        <w:t xml:space="preserve">│  F001        │  Smith    │  1920-1950        │  John Smith │</w:t>
+      </w:r>
+      <w:r>
+        <w:br/>
+      </w:r>
+      <w:r>
+        <w:rPr>
+          <w:rStyle w:val="VerbatimChar"/>
+        </w:rPr>
+        <w:t xml:space="preserve">│              │  Papers   │                   │             │</w:t>
+      </w:r>
+      <w:r>
+        <w:br/>
+      </w:r>
+      <w:r>
+        <w:rPr>
+          <w:rStyle w:val="VerbatimChar"/>
+        </w:rPr>
+        <w:t xml:space="preserve">├──────────────┼───────────┼───────────────────┼─────────────┤</w:t>
+      </w:r>
+      <w:r>
+        <w:br/>
+      </w:r>
+      <w:r>
+        <w:rPr>
+          <w:rStyle w:val="VerbatimChar"/>
+        </w:rPr>
+        <w:t xml:space="preserve">│  F001/S1     │  Corres-  │  1920-1935        │             │</w:t>
+      </w:r>
+      <w:r>
+        <w:br/>
+      </w:r>
+      <w:r>
+        <w:rPr>
+          <w:rStyle w:val="VerbatimChar"/>
+        </w:rPr>
+        <w:t xml:space="preserve">│              │  pondence │                   │             │</w:t>
+      </w:r>
+      <w:r>
+        <w:br/>
+      </w:r>
+      <w:r>
+        <w:rPr>
+          <w:rStyle w:val="VerbatimChar"/>
+        </w:rPr>
+        <w:t xml:space="preserve">└──────────────┴───────────┴───────────────────┴─────────────┘</w:t>
+      </w:r>
+    </w:p>
+    <w:bookmarkEnd w:id="43"/>
+    <w:bookmarkStart w:id="44" w:name="ead-files"/>
+    <w:p>
+      <w:pPr>
+        <w:pStyle w:val="Heading3"/>
+      </w:pPr>
+      <w:r>
+        <w:t xml:space="preserve">EAD Files</w:t>
+      </w:r>
+    </w:p>
+    <w:p>
+      <w:pPr>
+        <w:pStyle w:val="FirstParagraph"/>
+      </w:pPr>
+      <w:r>
+        <w:t xml:space="preserve">XML format for archival finding aids. Opens in text editors or specialised software.</w:t>
+      </w:r>
+    </w:p>
+    <w:p>
+      <w:pPr>
+        <w:pStyle w:val="SourceCode"/>
+      </w:pPr>
+      <w:r>
+        <w:rPr>
+          <w:rStyle w:val="NormalTok"/>
+        </w:rPr>
+        <w:t xml:space="preserve">&lt;</w:t>
+      </w:r>
+      <w:r>
+        <w:rPr>
+          <w:rStyle w:val="KeywordTok"/>
+        </w:rPr>
+        <w:t xml:space="preserve">ead</w:t>
+      </w:r>
+      <w:r>
+        <w:rPr>
+          <w:rStyle w:val="NormalTok"/>
+        </w:rPr>
+        <w:t xml:space="preserve">&gt;</w:t>
+      </w:r>
+      <w:r>
+        <w:br/>
+      </w:r>
+      <w:r>
+        <w:rPr>
+          <w:rStyle w:val="NormalTok"/>
+        </w:rPr>
+        <w:t xml:space="preserve">  &lt;</w:t>
+      </w:r>
+      <w:r>
+        <w:rPr>
+          <w:rStyle w:val="KeywordTok"/>
+        </w:rPr>
+        <w:t xml:space="preserve">archdesc</w:t>
+      </w:r>
+      <w:r>
+        <w:rPr>
+          <w:rStyle w:val="NormalTok"/>
+        </w:rPr>
+        <w:t xml:space="preserve">&gt;</w:t>
+      </w:r>
+      <w:r>
+        <w:br/>
+      </w:r>
+      <w:r>
+        <w:rPr>
+          <w:rStyle w:val="NormalTok"/>
+        </w:rPr>
+        <w:t xml:space="preserve">    &lt;</w:t>
+      </w:r>
+      <w:r>
+        <w:rPr>
+          <w:rStyle w:val="KeywordTok"/>
+        </w:rPr>
+        <w:t xml:space="preserve">did</w:t>
+      </w:r>
+      <w:r>
+        <w:rPr>
+          <w:rStyle w:val="NormalTok"/>
+        </w:rPr>
+        <w:t xml:space="preserve">&gt;</w:t>
+      </w:r>
+      <w:r>
+        <w:br/>
+      </w:r>
+      <w:r>
+        <w:rPr>
+          <w:rStyle w:val="NormalTok"/>
+        </w:rPr>
+        <w:t xml:space="preserve">      &lt;</w:t>
+      </w:r>
+      <w:r>
+        <w:rPr>
+          <w:rStyle w:val="KeywordTok"/>
+        </w:rPr>
+        <w:t xml:space="preserve">unitid</w:t>
+      </w:r>
+      <w:r>
+        <w:rPr>
+          <w:rStyle w:val="NormalTok"/>
+        </w:rPr>
+        <w:t xml:space="preserve">&gt;F001&lt;/</w:t>
+      </w:r>
+      <w:r>
+        <w:rPr>
+          <w:rStyle w:val="KeywordTok"/>
+        </w:rPr>
+        <w:t xml:space="preserve">unitid</w:t>
+      </w:r>
+      <w:r>
+        <w:rPr>
+          <w:rStyle w:val="NormalTok"/>
+        </w:rPr>
+        <w:t xml:space="preserve">&gt;</w:t>
+      </w:r>
+      <w:r>
+        <w:br/>
+      </w:r>
+      <w:r>
+        <w:rPr>
+          <w:rStyle w:val="NormalTok"/>
+        </w:rPr>
+        <w:t xml:space="preserve">      &lt;</w:t>
+      </w:r>
+      <w:r>
+        <w:rPr>
+          <w:rStyle w:val="KeywordTok"/>
+        </w:rPr>
+        <w:t xml:space="preserve">unittitle</w:t>
+      </w:r>
+      <w:r>
+        <w:rPr>
+          <w:rStyle w:val="NormalTok"/>
+        </w:rPr>
+        <w:t xml:space="preserve">&gt;Smith Papers&lt;/</w:t>
+      </w:r>
+      <w:r>
+        <w:rPr>
+          <w:rStyle w:val="KeywordTok"/>
+        </w:rPr>
+        <w:t xml:space="preserve">unittitle</w:t>
+      </w:r>
+      <w:r>
+        <w:rPr>
+          <w:rStyle w:val="NormalTok"/>
+        </w:rPr>
+        <w:t xml:space="preserve">&gt;</w:t>
+      </w:r>
+      <w:r>
+        <w:br/>
+      </w:r>
+      <w:r>
+        <w:rPr>
+          <w:rStyle w:val="NormalTok"/>
+        </w:rPr>
+        <w:t xml:space="preserve">      &lt;</w:t>
+      </w:r>
+      <w:r>
+        <w:rPr>
+          <w:rStyle w:val="KeywordTok"/>
+        </w:rPr>
+        <w:t xml:space="preserve">unitdate</w:t>
+      </w:r>
+      <w:r>
+        <w:rPr>
+          <w:rStyle w:val="NormalTok"/>
+        </w:rPr>
+        <w:t xml:space="preserve">&gt;1920-1950&lt;/</w:t>
+      </w:r>
+      <w:r>
+        <w:rPr>
+          <w:rStyle w:val="KeywordTok"/>
+        </w:rPr>
+        <w:t xml:space="preserve">unitdate</w:t>
+      </w:r>
+      <w:r>
+        <w:rPr>
+          <w:rStyle w:val="NormalTok"/>
+        </w:rPr>
+        <w:t xml:space="preserve">&gt;</w:t>
+      </w:r>
+      <w:r>
+        <w:br/>
+      </w:r>
+      <w:r>
+        <w:rPr>
+          <w:rStyle w:val="NormalTok"/>
+        </w:rPr>
+        <w:t xml:space="preserve">    &lt;/</w:t>
+      </w:r>
+      <w:r>
+        <w:rPr>
+          <w:rStyle w:val="KeywordTok"/>
+        </w:rPr>
+        <w:t xml:space="preserve">did</w:t>
+      </w:r>
+      <w:r>
+        <w:rPr>
+          <w:rStyle w:val="NormalTok"/>
+        </w:rPr>
+        <w:t xml:space="preserve">&gt;</w:t>
+      </w:r>
+      <w:r>
+        <w:br/>
+      </w:r>
+      <w:r>
+        <w:rPr>
+          <w:rStyle w:val="NormalTok"/>
+        </w:rPr>
+        <w:t xml:space="preserve">  &lt;/</w:t>
+      </w:r>
+      <w:r>
+        <w:rPr>
+          <w:rStyle w:val="KeywordTok"/>
+        </w:rPr>
+        <w:t xml:space="preserve">archdesc</w:t>
+      </w:r>
+      <w:r>
+        <w:rPr>
+          <w:rStyle w:val="NormalTok"/>
+        </w:rPr>
+        <w:t xml:space="preserve">&gt;</w:t>
+      </w:r>
+      <w:r>
+        <w:br/>
+      </w:r>
+      <w:r>
+        <w:rPr>
+          <w:rStyle w:val="NormalTok"/>
+        </w:rPr>
+        <w:t xml:space="preserve">&lt;/</w:t>
+      </w:r>
+      <w:r>
+        <w:rPr>
+          <w:rStyle w:val="KeywordTok"/>
+        </w:rPr>
+        <w:t xml:space="preserve">ead</w:t>
+      </w:r>
+      <w:r>
+        <w:rPr>
+          <w:rStyle w:val="NormalTok"/>
+        </w:rPr>
+        <w:t xml:space="preserve">&gt;</w:t>
+      </w:r>
+    </w:p>
+    <w:bookmarkEnd w:id="44"/>
+    <w:bookmarkStart w:id="45" w:name="dublin-core-files"/>
+    <w:p>
+      <w:pPr>
+        <w:pStyle w:val="Heading3"/>
+      </w:pPr>
+      <w:r>
+        <w:t xml:space="preserve">Dublin Core Files</w:t>
+      </w:r>
+    </w:p>
+    <w:p>
+      <w:pPr>
+        <w:pStyle w:val="FirstParagraph"/>
+      </w:pPr>
+      <w:r>
+        <w:t xml:space="preserve">Simple XML format for sharing metadata.</w:t>
+      </w:r>
+    </w:p>
+    <w:p>
+      <w:pPr>
+        <w:pStyle w:val="SourceCode"/>
+      </w:pPr>
+      <w:r>
+        <w:rPr>
+          <w:rStyle w:val="NormalTok"/>
+        </w:rPr>
+        <w:t xml:space="preserve">&lt;</w:t>
+      </w:r>
+      <w:r>
+        <w:rPr>
+          <w:rStyle w:val="KeywordTok"/>
+        </w:rPr>
+        <w:t xml:space="preserve">record</w:t>
+      </w:r>
+      <w:r>
+        <w:rPr>
+          <w:rStyle w:val="NormalTok"/>
+        </w:rPr>
+        <w:t xml:space="preserve">&gt;</w:t>
+      </w:r>
+      <w:r>
+        <w:br/>
+      </w:r>
+      <w:r>
+        <w:rPr>
+          <w:rStyle w:val="NormalTok"/>
+        </w:rPr>
+        <w:t xml:space="preserve">  &lt;</w:t>
+      </w:r>
+      <w:r>
+        <w:rPr>
+          <w:rStyle w:val="KeywordTok"/>
+        </w:rPr>
+        <w:t xml:space="preserve">dc:identifier</w:t>
+      </w:r>
+      <w:r>
+        <w:rPr>
+          <w:rStyle w:val="NormalTok"/>
+        </w:rPr>
+        <w:t xml:space="preserve">&gt;F001&lt;/</w:t>
+      </w:r>
+      <w:r>
+        <w:rPr>
+          <w:rStyle w:val="KeywordTok"/>
+        </w:rPr>
+        <w:t xml:space="preserve">dc:identifier</w:t>
+      </w:r>
+      <w:r>
+        <w:rPr>
+          <w:rStyle w:val="NormalTok"/>
+        </w:rPr>
+        <w:t xml:space="preserve">&gt;</w:t>
+      </w:r>
+      <w:r>
+        <w:br/>
+      </w:r>
+      <w:r>
+        <w:rPr>
+          <w:rStyle w:val="NormalTok"/>
+        </w:rPr>
+        <w:t xml:space="preserve">  &lt;</w:t>
+      </w:r>
+      <w:r>
+        <w:rPr>
+          <w:rStyle w:val="KeywordTok"/>
+        </w:rPr>
+        <w:t xml:space="preserve">dc:title</w:t>
+      </w:r>
+      <w:r>
+        <w:rPr>
+          <w:rStyle w:val="NormalTok"/>
+        </w:rPr>
+        <w:t xml:space="preserve">&gt;Smith Papers&lt;/</w:t>
+      </w:r>
+      <w:r>
+        <w:rPr>
+          <w:rStyle w:val="KeywordTok"/>
+        </w:rPr>
+        <w:t xml:space="preserve">dc:title</w:t>
+      </w:r>
+      <w:r>
+        <w:rPr>
+          <w:rStyle w:val="NormalTok"/>
+        </w:rPr>
+        <w:t xml:space="preserve">&gt;</w:t>
+      </w:r>
+      <w:r>
+        <w:br/>
+      </w:r>
+      <w:r>
+        <w:rPr>
+          <w:rStyle w:val="NormalTok"/>
+        </w:rPr>
+        <w:t xml:space="preserve">  &lt;</w:t>
+      </w:r>
+      <w:r>
+        <w:rPr>
+          <w:rStyle w:val="KeywordTok"/>
+        </w:rPr>
+        <w:t xml:space="preserve">dc:date</w:t>
+      </w:r>
+      <w:r>
+        <w:rPr>
+          <w:rStyle w:val="NormalTok"/>
+        </w:rPr>
+        <w:t xml:space="preserve">&gt;1920-1950&lt;/</w:t>
+      </w:r>
+      <w:r>
+        <w:rPr>
+          <w:rStyle w:val="KeywordTok"/>
+        </w:rPr>
+        <w:t xml:space="preserve">dc:date</w:t>
+      </w:r>
+      <w:r>
+        <w:rPr>
+          <w:rStyle w:val="NormalTok"/>
+        </w:rPr>
+        <w:t xml:space="preserve">&gt;</w:t>
+      </w:r>
+      <w:r>
+        <w:br/>
+      </w:r>
+      <w:r>
+        <w:rPr>
+          <w:rStyle w:val="NormalTok"/>
+        </w:rPr>
+        <w:t xml:space="preserve">&lt;/</w:t>
+      </w:r>
+      <w:r>
+        <w:rPr>
+          <w:rStyle w:val="KeywordTok"/>
+        </w:rPr>
+        <w:t xml:space="preserve">record</w:t>
+      </w:r>
+      <w:r>
+        <w:rPr>
+          <w:rStyle w:val="NormalTok"/>
+        </w:rPr>
+        <w:t xml:space="preserve">&gt;</w:t>
+      </w:r>
+    </w:p>
+    <w:p>
+      <w:r>
+        <w:pict>
+          <v:rect style="width:0;height:1.5pt" o:hralign="center" o:hrstd="t" o:hr="t"/>
+        </w:pict>
+      </w:r>
+    </w:p>
+    <w:bookmarkEnd w:id="45"/>
+    <w:bookmarkEnd w:id="46"/>
+    <w:bookmarkStart w:id="49" w:name="export-settings"/>
+    <w:p>
+      <w:pPr>
+        <w:pStyle w:val="Heading2"/>
+      </w:pPr>
+      <w:r>
         <w:t xml:space="preserve">Export Settings</w:t>
       </w:r>
     </w:p>
-    <w:bookmarkStart w:id="42" w:name="what-gets-exported"/>
+    <w:bookmarkStart w:id="47" w:name="what-gets-exported"/>
     <w:p>
       <w:pPr>
         <w:pStyle w:val="Heading3"/>
@@ -2900,8 +3936,8 @@
         </w:tc>
       </w:tr>
     </w:tbl>
-    <w:bookmarkEnd w:id="42"/>
-    <w:bookmarkStart w:id="43" w:name="field-selection"/>
+    <w:bookmarkEnd w:id="47"/>
+    <w:bookmarkStart w:id="48" w:name="field-selection"/>
     <w:p>
       <w:pPr>
         <w:pStyle w:val="Heading3"/>
@@ -3026,9 +4062,9 @@
         </w:pict>
       </w:r>
     </w:p>
-    <w:bookmarkEnd w:id="43"/>
-    <w:bookmarkEnd w:id="44"/>
-    <w:bookmarkStart w:id="45" w:name="tips-for-good-exports"/>
+    <w:bookmarkEnd w:id="48"/>
+    <w:bookmarkEnd w:id="49"/>
+    <w:bookmarkStart w:id="50" w:name="tips-for-good-exports"/>
     <w:p>
       <w:pPr>
         <w:pStyle w:val="Heading2"/>
@@ -3164,8 +4200,8 @@
         </w:pict>
       </w:r>
     </w:p>
-    <w:bookmarkEnd w:id="45"/>
-    <w:bookmarkStart w:id="46" w:name="troubleshooting"/>
+    <w:bookmarkEnd w:id="50"/>
+    <w:bookmarkStart w:id="51" w:name="troubleshooting"/>
     <w:p>
       <w:pPr>
         <w:pStyle w:val="Heading2"/>
@@ -3364,8 +4400,8 @@
         <w:t xml:space="preserve">For technical support, contact your system administrator.</w:t>
       </w:r>
     </w:p>
-    <w:bookmarkEnd w:id="46"/>
-    <w:bookmarkEnd w:id="47"/>
+    <w:bookmarkEnd w:id="51"/>
+    <w:bookmarkEnd w:id="52"/>
     <w:sectPr/>
   </w:body>
 </w:document>
@@ -3551,6 +4587,82 @@
       <w:start w:val="1"/>
       <w:numFmt w:val="decimal"/>
       <w:lvlText w:val="%9."/>
+      <w:lvlJc w:val="left"/>
+      <w:pPr>
+        <w:ind w:left="6480" w:hanging="480"/>
+      </w:pPr>
+    </w:lvl>
+  </w:abstractNum>
+  <w:abstractNum w:abstractNumId="991">
+    <w:nsid w:val="A991"/>
+    <w:multiLevelType w:val="multilevel"/>
+    <w:lvl w:ilvl="0">
+      <w:numFmt w:val="bullet"/>
+      <w:lvlText w:val="•"/>
+      <w:lvlJc w:val="left"/>
+      <w:pPr>
+        <w:ind w:left="720" w:hanging="480"/>
+      </w:pPr>
+    </w:lvl>
+    <w:lvl w:ilvl="1">
+      <w:numFmt w:val="bullet"/>
+      <w:lvlText w:val="–"/>
+      <w:lvlJc w:val="left"/>
+      <w:pPr>
+        <w:ind w:left="1440" w:hanging="480"/>
+      </w:pPr>
+    </w:lvl>
+    <w:lvl w:ilvl="2">
+      <w:numFmt w:val="bullet"/>
+      <w:lvlText w:val="•"/>
+      <w:lvlJc w:val="left"/>
+      <w:pPr>
+        <w:ind w:left="2160" w:hanging="480"/>
+      </w:pPr>
+    </w:lvl>
+    <w:lvl w:ilvl="3">
+      <w:numFmt w:val="bullet"/>
+      <w:lvlText w:val="–"/>
+      <w:lvlJc w:val="left"/>
+      <w:pPr>
+        <w:ind w:left="2880" w:hanging="480"/>
+      </w:pPr>
+    </w:lvl>
+    <w:lvl w:ilvl="4">
+      <w:numFmt w:val="bullet"/>
+      <w:lvlText w:val="•"/>
+      <w:lvlJc w:val="left"/>
+      <w:pPr>
+        <w:ind w:left="3600" w:hanging="480"/>
+      </w:pPr>
+    </w:lvl>
+    <w:lvl w:ilvl="5">
+      <w:numFmt w:val="bullet"/>
+      <w:lvlText w:val="–"/>
+      <w:lvlJc w:val="left"/>
+      <w:pPr>
+        <w:ind w:left="4320" w:hanging="480"/>
+      </w:pPr>
+    </w:lvl>
+    <w:lvl w:ilvl="6">
+      <w:numFmt w:val="bullet"/>
+      <w:lvlText w:val="•"/>
+      <w:lvlJc w:val="left"/>
+      <w:pPr>
+        <w:ind w:left="5040" w:hanging="480"/>
+      </w:pPr>
+    </w:lvl>
+    <w:lvl w:ilvl="7">
+      <w:numFmt w:val="bullet"/>
+      <w:lvlText w:val="–"/>
+      <w:lvlJc w:val="left"/>
+      <w:pPr>
+        <w:ind w:left="5760" w:hanging="480"/>
+      </w:pPr>
+    </w:lvl>
+    <w:lvl w:ilvl="8">
+      <w:numFmt w:val="bullet"/>
+      <w:lvlText w:val="•"/>
       <w:lvlJc w:val="left"/>
       <w:pPr>
         <w:ind w:left="6480" w:hanging="480"/>
@@ -3651,6 +4763,42 @@
     </w:lvlOverride>
   </w:num>
   <w:num w:numId="1004">
+    <w:abstractNumId w:val="99411"/>
+    <w:lvlOverride w:ilvl="0">
+      <w:startOverride w:val="1"/>
+    </w:lvlOverride>
+    <w:lvlOverride w:ilvl="1">
+      <w:startOverride w:val="1"/>
+    </w:lvlOverride>
+    <w:lvlOverride w:ilvl="2">
+      <w:startOverride w:val="1"/>
+    </w:lvlOverride>
+    <w:lvlOverride w:ilvl="3">
+      <w:startOverride w:val="1"/>
+    </w:lvlOverride>
+    <w:lvlOverride w:ilvl="4">
+      <w:startOverride w:val="1"/>
+    </w:lvlOverride>
+    <w:lvlOverride w:ilvl="5">
+      <w:startOverride w:val="1"/>
+    </w:lvlOverride>
+    <w:lvlOverride w:ilvl="6">
+      <w:startOverride w:val="1"/>
+    </w:lvlOverride>
+    <w:lvlOverride w:ilvl="7">
+      <w:startOverride w:val="1"/>
+    </w:lvlOverride>
+    <w:lvlOverride w:ilvl="8">
+      <w:startOverride w:val="1"/>
+    </w:lvlOverride>
+  </w:num>
+  <w:num w:numId="1005">
+    <w:abstractNumId w:val="991"/>
+  </w:num>
+  <w:num w:numId="1006">
+    <w:abstractNumId w:val="991"/>
+  </w:num>
+  <w:num w:numId="1007">
     <w:abstractNumId w:val="99411"/>
     <w:lvlOverride w:ilvl="0">
       <w:startOverride w:val="1"/>

</xml_diff>